<commit_message>
Day 1: Data ingestion complete
</commit_message>
<xml_diff>
--- a/reports/day1_data_quality_summary.docx
+++ b/reports/day1_data_quality_summary.docx
@@ -26,7 +26,7 @@
           <w:color w:val="708090"/>
           <w:sz w:val="20"/>
         </w:rPr>
-        <w:t>Mutual Fund Analytics Capstone Project | Day 1 Work Review</w:t>
+        <w:t>Mutual Fund Analytics Capstone Project | Day 1 Work Review (Real Datasets)</w:t>
       </w:r>
     </w:p>
     <w:p>
@@ -41,7 +41,7 @@
     </w:p>
     <w:p>
       <w:r>
-        <w:t>I did a deep dive into the 10 CSV files to check for quality issues. There are a few dirty spots (duplicates, missing fields, and date format mismatches) that we will need to clean up first thing tomorrow. I’ve detailed everything below.</w:t>
+        <w:t>I did a deep dive into the 10 real CSV files to check for quality issues. The datasets are practically pristine with no duplicates and excellent relational consistency. There is only one minor mathematically expected missing field which we'll address in the cleaning phase.</w:t>
       </w:r>
     </w:p>
     <w:p>
@@ -59,7 +59,7 @@
     </w:p>
     <w:p>
       <w:r>
-        <w:t xml:space="preserve">I set up the project folder structure inside the directory: </w:t>
+        <w:t xml:space="preserve">I verified the project folder structure inside the directory: </w:t>
       </w:r>
       <w:r>
         <w:rPr>
@@ -84,7 +84,7 @@
         <w:t>data/raw/</w:t>
       </w:r>
       <w:r>
-        <w:t xml:space="preserve"> - Active. This contains the 10 original local CSV datasets, plus the raw historical CSVs I downloaded from the API.</w:t>
+        <w:t xml:space="preserve"> - Active. Contains the 10 prefixed local CSV datasets, plus the raw historical CSVs downloaded from the API.</w:t>
       </w:r>
     </w:p>
     <w:p>
@@ -98,7 +98,7 @@
         <w:t>data/processed/</w:t>
       </w:r>
       <w:r>
-        <w:t xml:space="preserve"> - Empty. This is intentional! It is currently an empty staging folder. I will be outputting our deduplicated, clean, and merged datasets here during tomorrow's cleaning phase.</w:t>
+        <w:t xml:space="preserve"> - Empty. An empty staging folder. Deduplicated, clean, and merged datasets will be saved here during the Day 2 cleaning phase.</w:t>
       </w:r>
     </w:p>
     <w:p>
@@ -112,7 +112,7 @@
         <w:t>notebooks/</w:t>
       </w:r>
       <w:r>
-        <w:t xml:space="preserve"> - Placeholder. Set up and ready for Jupyter/Google Colab notebooks for explorative analysis.</w:t>
+        <w:t xml:space="preserve"> - Placeholder. Set up and ready for Jupyter notebooks for explorative analysis (EDA).</w:t>
       </w:r>
     </w:p>
     <w:p>
@@ -140,7 +140,7 @@
         <w:t>dashboard/</w:t>
       </w:r>
       <w:r>
-        <w:t xml:space="preserve"> - Empty. Another intentional placeholder. I'll be using this directory later to store the visual assets, styling sheets, and configuration files for the UI and dashboard widgets.</w:t>
+        <w:t xml:space="preserve"> - Staging. Set up for Power BI visual assets and dashboard files.</w:t>
       </w:r>
     </w:p>
     <w:p>
@@ -154,7 +154,7 @@
         <w:t>reports/</w:t>
       </w:r>
       <w:r>
-        <w:t xml:space="preserve"> - Active. Where I'm saving our documentation, summaries, and data quality reports.</w:t>
+        <w:t xml:space="preserve"> - Active. Where documentation, summaries, and data quality reports are stored.</w:t>
       </w:r>
     </w:p>
     <w:p>
@@ -168,12 +168,12 @@
         <w:t xml:space="preserve">Quick Note on Environment: </w:t>
       </w:r>
       <w:r>
-        <w:t>I successfully initialized the local Git repository and set up the remote pointing to our GitHub repository. Everything has been committed cleanly under the message "Day 1: Data ingestion complete".</w:t>
+        <w:t>I initialized the local Git repository and set up the remote pointing to our GitHub repository. All changes are committed cleanly under "Day 1: Data ingestion complete".</w:t>
       </w:r>
     </w:p>
     <w:p>
       <w:r>
-        <w:t>I also created requirements.txt with all the specific versions we need for the analytical stack (Pandas, NumPy, Matplotlib, Seaborn, Plotly, SQLAlchemy, Requests, SciPy, and Jupyter).</w:t>
+        <w:t>I also created requirements.txt with all dependencies for the analytical stack (Pandas, NumPy, Matplotlib, Seaborn, Plotly, SQLAlchemy, Requests, SciPy, and Jupyter).</w:t>
       </w:r>
     </w:p>
     <w:p>
@@ -191,7 +191,7 @@
     </w:p>
     <w:p>
       <w:r>
-        <w:t>I wrote an ETL script (data_ingestion.py) to systematically load and inspect all 10 source CSV files using Pandas. Here is the exact profile of the data as it stands:</w:t>
+        <w:t>I updated the ETL script (data_ingestion.py) to systematically load and inspect all 10 real source CSV files using Pandas. Here is the exact profile of the data as it stands:</w:t>
       </w:r>
     </w:p>
     <w:tbl>
@@ -336,7 +336,7 @@
               <w:rPr>
                 <w:sz w:val="19"/>
               </w:rPr>
-              <w:t>fund_master.csv</w:t>
+              <w:t>01_fund_master.csv</w:t>
             </w:r>
           </w:p>
         </w:tc>
@@ -356,7 +356,7 @@
               <w:rPr>
                 <w:sz w:val="19"/>
               </w:rPr>
-              <w:t>12 x 6</w:t>
+              <w:t>40 x 15</w:t>
             </w:r>
           </w:p>
         </w:tc>
@@ -414,11 +414,10 @@
           <w:p>
             <w:r>
               <w:rPr>
-                <w:b/>
-                <w:color w:val="C0392B"/>
+                <w:color w:val="2E7D32"/>
                 <w:sz w:val="19"/>
               </w:rPr>
-              <w:t>Dirty (Nulls &amp; Duplicates)</w:t>
+              <w:t>Clean</w:t>
             </w:r>
           </w:p>
         </w:tc>
@@ -440,7 +439,7 @@
               <w:rPr>
                 <w:sz w:val="19"/>
               </w:rPr>
-              <w:t>nav_history.csv</w:t>
+              <w:t>02_nav_history.csv</w:t>
             </w:r>
           </w:p>
         </w:tc>
@@ -460,7 +459,7 @@
               <w:rPr>
                 <w:sz w:val="19"/>
               </w:rPr>
-              <w:t>101 x 3</w:t>
+              <w:t>46,000 x 3</w:t>
             </w:r>
           </w:p>
         </w:tc>
@@ -518,11 +517,10 @@
           <w:p>
             <w:r>
               <w:rPr>
-                <w:b/>
-                <w:color w:val="C0392B"/>
+                <w:color w:val="2E7D32"/>
                 <w:sz w:val="19"/>
               </w:rPr>
-              <w:t>Dirty (Mixed date formats)</w:t>
+              <w:t>Clean</w:t>
             </w:r>
           </w:p>
         </w:tc>
@@ -544,7 +542,7 @@
               <w:rPr>
                 <w:sz w:val="19"/>
               </w:rPr>
-              <w:t>investors.csv</w:t>
+              <w:t>03_aum_by_fund_house.csv</w:t>
             </w:r>
           </w:p>
         </w:tc>
@@ -564,7 +562,7 @@
               <w:rPr>
                 <w:sz w:val="19"/>
               </w:rPr>
-              <w:t>5 x 5</w:t>
+              <w:t>90 x 5</w:t>
             </w:r>
           </w:p>
         </w:tc>
@@ -584,7 +582,7 @@
               <w:rPr>
                 <w:sz w:val="19"/>
               </w:rPr>
-              <w:t>investor_id</w:t>
+              <w:t>date + fund_house</w:t>
             </w:r>
           </w:p>
         </w:tc>
@@ -604,215 +602,7 @@
               <w:rPr>
                 <w:sz w:val="19"/>
               </w:rPr>
-              <w:t>object, object (string)</w:t>
-            </w:r>
-          </w:p>
-        </w:tc>
-        <w:tc>
-          <w:tcPr>
-            <w:tcW w:type="dxa" w:w="1872"/>
-            <w:shd w:fill="FFFFFF"/>
-            <w:tcMar>
-              <w:top w:w="80" w:type="dxa"/>
-              <w:bottom w:w="80" w:type="dxa"/>
-              <w:left w:w="150" w:type="dxa"/>
-              <w:right w:w="150" w:type="dxa"/>
-            </w:tcMar>
-          </w:tcPr>
-          <w:p>
-            <w:r>
-              <w:rPr>
-                <w:b/>
-                <w:color w:val="C0392B"/>
-                <w:sz w:val="19"/>
-              </w:rPr>
-              <w:t>Dirty (Has nulls)</w:t>
-            </w:r>
-          </w:p>
-        </w:tc>
-      </w:tr>
-      <w:tr>
-        <w:tc>
-          <w:tcPr>
-            <w:tcW w:type="dxa" w:w="1872"/>
-            <w:shd w:fill="F2F5F8"/>
-            <w:tcMar>
-              <w:top w:w="80" w:type="dxa"/>
-              <w:bottom w:w="80" w:type="dxa"/>
-              <w:left w:w="150" w:type="dxa"/>
-              <w:right w:w="150" w:type="dxa"/>
-            </w:tcMar>
-          </w:tcPr>
-          <w:p>
-            <w:r>
-              <w:rPr>
-                <w:sz w:val="19"/>
-              </w:rPr>
-              <w:t>transactions.csv</w:t>
-            </w:r>
-          </w:p>
-        </w:tc>
-        <w:tc>
-          <w:tcPr>
-            <w:tcW w:type="dxa" w:w="1872"/>
-            <w:shd w:fill="F2F5F8"/>
-            <w:tcMar>
-              <w:top w:w="80" w:type="dxa"/>
-              <w:bottom w:w="80" w:type="dxa"/>
-              <w:left w:w="150" w:type="dxa"/>
-              <w:right w:w="150" w:type="dxa"/>
-            </w:tcMar>
-          </w:tcPr>
-          <w:p>
-            <w:r>
-              <w:rPr>
-                <w:sz w:val="19"/>
-              </w:rPr>
-              <w:t>6 x 7</w:t>
-            </w:r>
-          </w:p>
-        </w:tc>
-        <w:tc>
-          <w:tcPr>
-            <w:tcW w:type="dxa" w:w="1872"/>
-            <w:shd w:fill="F2F5F8"/>
-            <w:tcMar>
-              <w:top w:w="80" w:type="dxa"/>
-              <w:bottom w:w="80" w:type="dxa"/>
-              <w:left w:w="150" w:type="dxa"/>
-              <w:right w:w="150" w:type="dxa"/>
-            </w:tcMar>
-          </w:tcPr>
-          <w:p>
-            <w:r>
-              <w:rPr>
-                <w:sz w:val="19"/>
-              </w:rPr>
-              <w:t>transaction_id</w:t>
-            </w:r>
-          </w:p>
-        </w:tc>
-        <w:tc>
-          <w:tcPr>
-            <w:tcW w:type="dxa" w:w="1872"/>
-            <w:shd w:fill="F2F5F8"/>
-            <w:tcMar>
-              <w:top w:w="80" w:type="dxa"/>
-              <w:bottom w:w="80" w:type="dxa"/>
-              <w:left w:w="150" w:type="dxa"/>
-              <w:right w:w="150" w:type="dxa"/>
-            </w:tcMar>
-          </w:tcPr>
-          <w:p>
-            <w:r>
-              <w:rPr>
-                <w:sz w:val="19"/>
-              </w:rPr>
-              <w:t>object, int64, float64</w:t>
-            </w:r>
-          </w:p>
-        </w:tc>
-        <w:tc>
-          <w:tcPr>
-            <w:tcW w:type="dxa" w:w="1872"/>
-            <w:shd w:fill="F2F5F8"/>
-            <w:tcMar>
-              <w:top w:w="80" w:type="dxa"/>
-              <w:bottom w:w="80" w:type="dxa"/>
-              <w:left w:w="150" w:type="dxa"/>
-              <w:right w:w="150" w:type="dxa"/>
-            </w:tcMar>
-          </w:tcPr>
-          <w:p>
-            <w:r>
-              <w:rPr>
-                <w:b/>
-                <w:color w:val="C0392B"/>
-                <w:sz w:val="19"/>
-              </w:rPr>
-              <w:t>Dirty (Nulls &amp; Duplicates)</w:t>
-            </w:r>
-          </w:p>
-        </w:tc>
-      </w:tr>
-      <w:tr>
-        <w:tc>
-          <w:tcPr>
-            <w:tcW w:type="dxa" w:w="1872"/>
-            <w:shd w:fill="FFFFFF"/>
-            <w:tcMar>
-              <w:top w:w="80" w:type="dxa"/>
-              <w:bottom w:w="80" w:type="dxa"/>
-              <w:left w:w="150" w:type="dxa"/>
-              <w:right w:w="150" w:type="dxa"/>
-            </w:tcMar>
-          </w:tcPr>
-          <w:p>
-            <w:r>
-              <w:rPr>
-                <w:sz w:val="19"/>
-              </w:rPr>
-              <w:t>fund_managers.csv</w:t>
-            </w:r>
-          </w:p>
-        </w:tc>
-        <w:tc>
-          <w:tcPr>
-            <w:tcW w:type="dxa" w:w="1872"/>
-            <w:shd w:fill="FFFFFF"/>
-            <w:tcMar>
-              <w:top w:w="80" w:type="dxa"/>
-              <w:bottom w:w="80" w:type="dxa"/>
-              <w:left w:w="150" w:type="dxa"/>
-              <w:right w:w="150" w:type="dxa"/>
-            </w:tcMar>
-          </w:tcPr>
-          <w:p>
-            <w:r>
-              <w:rPr>
-                <w:sz w:val="19"/>
-              </w:rPr>
-              <w:t>4 x 4</w:t>
-            </w:r>
-          </w:p>
-        </w:tc>
-        <w:tc>
-          <w:tcPr>
-            <w:tcW w:type="dxa" w:w="1872"/>
-            <w:shd w:fill="FFFFFF"/>
-            <w:tcMar>
-              <w:top w:w="80" w:type="dxa"/>
-              <w:bottom w:w="80" w:type="dxa"/>
-              <w:left w:w="150" w:type="dxa"/>
-              <w:right w:w="150" w:type="dxa"/>
-            </w:tcMar>
-          </w:tcPr>
-          <w:p>
-            <w:r>
-              <w:rPr>
-                <w:sz w:val="19"/>
-              </w:rPr>
-              <w:t>manager_id</w:t>
-            </w:r>
-          </w:p>
-        </w:tc>
-        <w:tc>
-          <w:tcPr>
-            <w:tcW w:type="dxa" w:w="1872"/>
-            <w:shd w:fill="FFFFFF"/>
-            <w:tcMar>
-              <w:top w:w="80" w:type="dxa"/>
-              <w:bottom w:w="80" w:type="dxa"/>
-              <w:left w:w="150" w:type="dxa"/>
-              <w:right w:w="150" w:type="dxa"/>
-            </w:tcMar>
-          </w:tcPr>
-          <w:p>
-            <w:r>
-              <w:rPr>
-                <w:sz w:val="19"/>
-              </w:rPr>
-              <w:t>object, int64, object</w:t>
+              <w:t>object, float64, int64</w:t>
             </w:r>
           </w:p>
         </w:tc>
@@ -855,7 +645,7 @@
               <w:rPr>
                 <w:sz w:val="19"/>
               </w:rPr>
-              <w:t>portfolio_holdings.csv</w:t>
+              <w:t>04_monthly_sip_inflows.csv</w:t>
             </w:r>
           </w:p>
         </w:tc>
@@ -875,7 +665,7 @@
               <w:rPr>
                 <w:sz w:val="19"/>
               </w:rPr>
-              <w:t>5 x 5</w:t>
+              <w:t>48 x 6</w:t>
             </w:r>
           </w:p>
         </w:tc>
@@ -895,7 +685,420 @@
               <w:rPr>
                 <w:sz w:val="19"/>
               </w:rPr>
-              <w:t>holding_id</w:t>
+              <w:t>month</w:t>
+            </w:r>
+          </w:p>
+        </w:tc>
+        <w:tc>
+          <w:tcPr>
+            <w:tcW w:type="dxa" w:w="1872"/>
+            <w:shd w:fill="F2F5F8"/>
+            <w:tcMar>
+              <w:top w:w="80" w:type="dxa"/>
+              <w:bottom w:w="80" w:type="dxa"/>
+              <w:left w:w="150" w:type="dxa"/>
+              <w:right w:w="150" w:type="dxa"/>
+            </w:tcMar>
+          </w:tcPr>
+          <w:p>
+            <w:r>
+              <w:rPr>
+                <w:sz w:val="19"/>
+              </w:rPr>
+              <w:t>object, int64, float64</w:t>
+            </w:r>
+          </w:p>
+        </w:tc>
+        <w:tc>
+          <w:tcPr>
+            <w:tcW w:type="dxa" w:w="1872"/>
+            <w:shd w:fill="F2F5F8"/>
+            <w:tcMar>
+              <w:top w:w="80" w:type="dxa"/>
+              <w:bottom w:w="80" w:type="dxa"/>
+              <w:left w:w="150" w:type="dxa"/>
+              <w:right w:w="150" w:type="dxa"/>
+            </w:tcMar>
+          </w:tcPr>
+          <w:p>
+            <w:r>
+              <w:rPr>
+                <w:b/>
+                <w:color w:val="C0392B"/>
+                <w:sz w:val="19"/>
+              </w:rPr>
+              <w:t>Minor Anomaly</w:t>
+            </w:r>
+          </w:p>
+        </w:tc>
+      </w:tr>
+      <w:tr>
+        <w:tc>
+          <w:tcPr>
+            <w:tcW w:type="dxa" w:w="1872"/>
+            <w:shd w:fill="FFFFFF"/>
+            <w:tcMar>
+              <w:top w:w="80" w:type="dxa"/>
+              <w:bottom w:w="80" w:type="dxa"/>
+              <w:left w:w="150" w:type="dxa"/>
+              <w:right w:w="150" w:type="dxa"/>
+            </w:tcMar>
+          </w:tcPr>
+          <w:p>
+            <w:r>
+              <w:rPr>
+                <w:sz w:val="19"/>
+              </w:rPr>
+              <w:t>05_category_inflows.csv</w:t>
+            </w:r>
+          </w:p>
+        </w:tc>
+        <w:tc>
+          <w:tcPr>
+            <w:tcW w:type="dxa" w:w="1872"/>
+            <w:shd w:fill="FFFFFF"/>
+            <w:tcMar>
+              <w:top w:w="80" w:type="dxa"/>
+              <w:bottom w:w="80" w:type="dxa"/>
+              <w:left w:w="150" w:type="dxa"/>
+              <w:right w:w="150" w:type="dxa"/>
+            </w:tcMar>
+          </w:tcPr>
+          <w:p>
+            <w:r>
+              <w:rPr>
+                <w:sz w:val="19"/>
+              </w:rPr>
+              <w:t>144 x 3</w:t>
+            </w:r>
+          </w:p>
+        </w:tc>
+        <w:tc>
+          <w:tcPr>
+            <w:tcW w:type="dxa" w:w="1872"/>
+            <w:shd w:fill="FFFFFF"/>
+            <w:tcMar>
+              <w:top w:w="80" w:type="dxa"/>
+              <w:bottom w:w="80" w:type="dxa"/>
+              <w:left w:w="150" w:type="dxa"/>
+              <w:right w:w="150" w:type="dxa"/>
+            </w:tcMar>
+          </w:tcPr>
+          <w:p>
+            <w:r>
+              <w:rPr>
+                <w:sz w:val="19"/>
+              </w:rPr>
+              <w:t>month + category</w:t>
+            </w:r>
+          </w:p>
+        </w:tc>
+        <w:tc>
+          <w:tcPr>
+            <w:tcW w:type="dxa" w:w="1872"/>
+            <w:shd w:fill="FFFFFF"/>
+            <w:tcMar>
+              <w:top w:w="80" w:type="dxa"/>
+              <w:bottom w:w="80" w:type="dxa"/>
+              <w:left w:w="150" w:type="dxa"/>
+              <w:right w:w="150" w:type="dxa"/>
+            </w:tcMar>
+          </w:tcPr>
+          <w:p>
+            <w:r>
+              <w:rPr>
+                <w:sz w:val="19"/>
+              </w:rPr>
+              <w:t>object, float64</w:t>
+            </w:r>
+          </w:p>
+        </w:tc>
+        <w:tc>
+          <w:tcPr>
+            <w:tcW w:type="dxa" w:w="1872"/>
+            <w:shd w:fill="FFFFFF"/>
+            <w:tcMar>
+              <w:top w:w="80" w:type="dxa"/>
+              <w:bottom w:w="80" w:type="dxa"/>
+              <w:left w:w="150" w:type="dxa"/>
+              <w:right w:w="150" w:type="dxa"/>
+            </w:tcMar>
+          </w:tcPr>
+          <w:p>
+            <w:r>
+              <w:rPr>
+                <w:color w:val="2E7D32"/>
+                <w:sz w:val="19"/>
+              </w:rPr>
+              <w:t>Clean</w:t>
+            </w:r>
+          </w:p>
+        </w:tc>
+      </w:tr>
+      <w:tr>
+        <w:tc>
+          <w:tcPr>
+            <w:tcW w:type="dxa" w:w="1872"/>
+            <w:shd w:fill="F2F5F8"/>
+            <w:tcMar>
+              <w:top w:w="80" w:type="dxa"/>
+              <w:bottom w:w="80" w:type="dxa"/>
+              <w:left w:w="150" w:type="dxa"/>
+              <w:right w:w="150" w:type="dxa"/>
+            </w:tcMar>
+          </w:tcPr>
+          <w:p>
+            <w:r>
+              <w:rPr>
+                <w:sz w:val="19"/>
+              </w:rPr>
+              <w:t>06_industry_folio_count.csv</w:t>
+            </w:r>
+          </w:p>
+        </w:tc>
+        <w:tc>
+          <w:tcPr>
+            <w:tcW w:type="dxa" w:w="1872"/>
+            <w:shd w:fill="F2F5F8"/>
+            <w:tcMar>
+              <w:top w:w="80" w:type="dxa"/>
+              <w:bottom w:w="80" w:type="dxa"/>
+              <w:left w:w="150" w:type="dxa"/>
+              <w:right w:w="150" w:type="dxa"/>
+            </w:tcMar>
+          </w:tcPr>
+          <w:p>
+            <w:r>
+              <w:rPr>
+                <w:sz w:val="19"/>
+              </w:rPr>
+              <w:t>21 x 6</w:t>
+            </w:r>
+          </w:p>
+        </w:tc>
+        <w:tc>
+          <w:tcPr>
+            <w:tcW w:type="dxa" w:w="1872"/>
+            <w:shd w:fill="F2F5F8"/>
+            <w:tcMar>
+              <w:top w:w="80" w:type="dxa"/>
+              <w:bottom w:w="80" w:type="dxa"/>
+              <w:left w:w="150" w:type="dxa"/>
+              <w:right w:w="150" w:type="dxa"/>
+            </w:tcMar>
+          </w:tcPr>
+          <w:p>
+            <w:r>
+              <w:rPr>
+                <w:sz w:val="19"/>
+              </w:rPr>
+              <w:t>month</w:t>
+            </w:r>
+          </w:p>
+        </w:tc>
+        <w:tc>
+          <w:tcPr>
+            <w:tcW w:type="dxa" w:w="1872"/>
+            <w:shd w:fill="F2F5F8"/>
+            <w:tcMar>
+              <w:top w:w="80" w:type="dxa"/>
+              <w:bottom w:w="80" w:type="dxa"/>
+              <w:left w:w="150" w:type="dxa"/>
+              <w:right w:w="150" w:type="dxa"/>
+            </w:tcMar>
+          </w:tcPr>
+          <w:p>
+            <w:r>
+              <w:rPr>
+                <w:sz w:val="19"/>
+              </w:rPr>
+              <w:t>object, float64</w:t>
+            </w:r>
+          </w:p>
+        </w:tc>
+        <w:tc>
+          <w:tcPr>
+            <w:tcW w:type="dxa" w:w="1872"/>
+            <w:shd w:fill="F2F5F8"/>
+            <w:tcMar>
+              <w:top w:w="80" w:type="dxa"/>
+              <w:bottom w:w="80" w:type="dxa"/>
+              <w:left w:w="150" w:type="dxa"/>
+              <w:right w:w="150" w:type="dxa"/>
+            </w:tcMar>
+          </w:tcPr>
+          <w:p>
+            <w:r>
+              <w:rPr>
+                <w:color w:val="2E7D32"/>
+                <w:sz w:val="19"/>
+              </w:rPr>
+              <w:t>Clean</w:t>
+            </w:r>
+          </w:p>
+        </w:tc>
+      </w:tr>
+      <w:tr>
+        <w:tc>
+          <w:tcPr>
+            <w:tcW w:type="dxa" w:w="1872"/>
+            <w:shd w:fill="FFFFFF"/>
+            <w:tcMar>
+              <w:top w:w="80" w:type="dxa"/>
+              <w:bottom w:w="80" w:type="dxa"/>
+              <w:left w:w="150" w:type="dxa"/>
+              <w:right w:w="150" w:type="dxa"/>
+            </w:tcMar>
+          </w:tcPr>
+          <w:p>
+            <w:r>
+              <w:rPr>
+                <w:sz w:val="19"/>
+              </w:rPr>
+              <w:t>07_scheme_performance.csv</w:t>
+            </w:r>
+          </w:p>
+        </w:tc>
+        <w:tc>
+          <w:tcPr>
+            <w:tcW w:type="dxa" w:w="1872"/>
+            <w:shd w:fill="FFFFFF"/>
+            <w:tcMar>
+              <w:top w:w="80" w:type="dxa"/>
+              <w:bottom w:w="80" w:type="dxa"/>
+              <w:left w:w="150" w:type="dxa"/>
+              <w:right w:w="150" w:type="dxa"/>
+            </w:tcMar>
+          </w:tcPr>
+          <w:p>
+            <w:r>
+              <w:rPr>
+                <w:sz w:val="19"/>
+              </w:rPr>
+              <w:t>40 x 19</w:t>
+            </w:r>
+          </w:p>
+        </w:tc>
+        <w:tc>
+          <w:tcPr>
+            <w:tcW w:type="dxa" w:w="1872"/>
+            <w:shd w:fill="FFFFFF"/>
+            <w:tcMar>
+              <w:top w:w="80" w:type="dxa"/>
+              <w:bottom w:w="80" w:type="dxa"/>
+              <w:left w:w="150" w:type="dxa"/>
+              <w:right w:w="150" w:type="dxa"/>
+            </w:tcMar>
+          </w:tcPr>
+          <w:p>
+            <w:r>
+              <w:rPr>
+                <w:sz w:val="19"/>
+              </w:rPr>
+              <w:t>amfi_code</w:t>
+            </w:r>
+          </w:p>
+        </w:tc>
+        <w:tc>
+          <w:tcPr>
+            <w:tcW w:type="dxa" w:w="1872"/>
+            <w:shd w:fill="FFFFFF"/>
+            <w:tcMar>
+              <w:top w:w="80" w:type="dxa"/>
+              <w:bottom w:w="80" w:type="dxa"/>
+              <w:left w:w="150" w:type="dxa"/>
+              <w:right w:w="150" w:type="dxa"/>
+            </w:tcMar>
+          </w:tcPr>
+          <w:p>
+            <w:r>
+              <w:rPr>
+                <w:sz w:val="19"/>
+              </w:rPr>
+              <w:t>int64, object, float64</w:t>
+            </w:r>
+          </w:p>
+        </w:tc>
+        <w:tc>
+          <w:tcPr>
+            <w:tcW w:type="dxa" w:w="1872"/>
+            <w:shd w:fill="FFFFFF"/>
+            <w:tcMar>
+              <w:top w:w="80" w:type="dxa"/>
+              <w:bottom w:w="80" w:type="dxa"/>
+              <w:left w:w="150" w:type="dxa"/>
+              <w:right w:w="150" w:type="dxa"/>
+            </w:tcMar>
+          </w:tcPr>
+          <w:p>
+            <w:r>
+              <w:rPr>
+                <w:color w:val="2E7D32"/>
+                <w:sz w:val="19"/>
+              </w:rPr>
+              <w:t>Clean</w:t>
+            </w:r>
+          </w:p>
+        </w:tc>
+      </w:tr>
+      <w:tr>
+        <w:tc>
+          <w:tcPr>
+            <w:tcW w:type="dxa" w:w="1872"/>
+            <w:shd w:fill="F2F5F8"/>
+            <w:tcMar>
+              <w:top w:w="80" w:type="dxa"/>
+              <w:bottom w:w="80" w:type="dxa"/>
+              <w:left w:w="150" w:type="dxa"/>
+              <w:right w:w="150" w:type="dxa"/>
+            </w:tcMar>
+          </w:tcPr>
+          <w:p>
+            <w:r>
+              <w:rPr>
+                <w:sz w:val="19"/>
+              </w:rPr>
+              <w:t>08_investor_transactions.csv</w:t>
+            </w:r>
+          </w:p>
+        </w:tc>
+        <w:tc>
+          <w:tcPr>
+            <w:tcW w:type="dxa" w:w="1872"/>
+            <w:shd w:fill="F2F5F8"/>
+            <w:tcMar>
+              <w:top w:w="80" w:type="dxa"/>
+              <w:bottom w:w="80" w:type="dxa"/>
+              <w:left w:w="150" w:type="dxa"/>
+              <w:right w:w="150" w:type="dxa"/>
+            </w:tcMar>
+          </w:tcPr>
+          <w:p>
+            <w:r>
+              <w:rPr>
+                <w:sz w:val="19"/>
+              </w:rPr>
+              <w:t>32,778 x 13</w:t>
+            </w:r>
+          </w:p>
+        </w:tc>
+        <w:tc>
+          <w:tcPr>
+            <w:tcW w:type="dxa" w:w="1872"/>
+            <w:shd w:fill="F2F5F8"/>
+            <w:tcMar>
+              <w:top w:w="80" w:type="dxa"/>
+              <w:bottom w:w="80" w:type="dxa"/>
+              <w:left w:w="150" w:type="dxa"/>
+              <w:right w:w="150" w:type="dxa"/>
+            </w:tcMar>
+          </w:tcPr>
+          <w:p>
+            <w:r>
+              <w:rPr>
+                <w:sz w:val="19"/>
+              </w:rPr>
+              <w:t>investor_id + date</w:t>
             </w:r>
           </w:p>
         </w:tc>
@@ -958,7 +1161,7 @@
               <w:rPr>
                 <w:sz w:val="19"/>
               </w:rPr>
-              <w:t>amc_details.csv</w:t>
+              <w:t>09_portfolio_holdings.csv</w:t>
             </w:r>
           </w:p>
         </w:tc>
@@ -978,7 +1181,7 @@
               <w:rPr>
                 <w:sz w:val="19"/>
               </w:rPr>
-              <w:t>4 x 5</w:t>
+              <w:t>322 x 8</w:t>
             </w:r>
           </w:p>
         </w:tc>
@@ -998,7 +1201,7 @@
               <w:rPr>
                 <w:sz w:val="19"/>
               </w:rPr>
-              <w:t>amc_id</w:t>
+              <w:t>amfi_code + stock</w:t>
             </w:r>
           </w:p>
         </w:tc>
@@ -1018,7 +1221,7 @@
               <w:rPr>
                 <w:sz w:val="19"/>
               </w:rPr>
-              <w:t>object, int64, int64</w:t>
+              <w:t>int64, object, float64</w:t>
             </w:r>
           </w:p>
         </w:tc>
@@ -1061,7 +1264,7 @@
               <w:rPr>
                 <w:sz w:val="19"/>
               </w:rPr>
-              <w:t>expense_ratios.csv</w:t>
+              <w:t>10_benchmark_indices.csv</w:t>
             </w:r>
           </w:p>
         </w:tc>
@@ -1081,7 +1284,7 @@
               <w:rPr>
                 <w:sz w:val="19"/>
               </w:rPr>
-              <w:t>4 x 4</w:t>
+              <w:t>8,050 x 3</w:t>
             </w:r>
           </w:p>
         </w:tc>
@@ -1101,7 +1304,7 @@
               <w:rPr>
                 <w:sz w:val="19"/>
               </w:rPr>
-              <w:t>amfi_code</w:t>
+              <w:t>date + index_name</w:t>
             </w:r>
           </w:p>
         </w:tc>
@@ -1121,213 +1324,7 @@
               <w:rPr>
                 <w:sz w:val="19"/>
               </w:rPr>
-              <w:t>int64, float64, float64</w:t>
-            </w:r>
-          </w:p>
-        </w:tc>
-        <w:tc>
-          <w:tcPr>
-            <w:tcW w:type="dxa" w:w="1872"/>
-            <w:shd w:fill="F2F5F8"/>
-            <w:tcMar>
-              <w:top w:w="80" w:type="dxa"/>
-              <w:bottom w:w="80" w:type="dxa"/>
-              <w:left w:w="150" w:type="dxa"/>
-              <w:right w:w="150" w:type="dxa"/>
-            </w:tcMar>
-          </w:tcPr>
-          <w:p>
-            <w:r>
-              <w:rPr>
-                <w:color w:val="2E7D32"/>
-                <w:sz w:val="19"/>
-              </w:rPr>
-              <w:t>Clean</w:t>
-            </w:r>
-          </w:p>
-        </w:tc>
-      </w:tr>
-      <w:tr>
-        <w:tc>
-          <w:tcPr>
-            <w:tcW w:type="dxa" w:w="1872"/>
-            <w:shd w:fill="FFFFFF"/>
-            <w:tcMar>
-              <w:top w:w="80" w:type="dxa"/>
-              <w:bottom w:w="80" w:type="dxa"/>
-              <w:left w:w="150" w:type="dxa"/>
-              <w:right w:w="150" w:type="dxa"/>
-            </w:tcMar>
-          </w:tcPr>
-          <w:p>
-            <w:r>
-              <w:rPr>
-                <w:sz w:val="19"/>
-              </w:rPr>
-              <w:t>benchmarks.csv</w:t>
-            </w:r>
-          </w:p>
-        </w:tc>
-        <w:tc>
-          <w:tcPr>
-            <w:tcW w:type="dxa" w:w="1872"/>
-            <w:shd w:fill="FFFFFF"/>
-            <w:tcMar>
-              <w:top w:w="80" w:type="dxa"/>
-              <w:bottom w:w="80" w:type="dxa"/>
-              <w:left w:w="150" w:type="dxa"/>
-              <w:right w:w="150" w:type="dxa"/>
-            </w:tcMar>
-          </w:tcPr>
-          <w:p>
-            <w:r>
-              <w:rPr>
-                <w:sz w:val="19"/>
-              </w:rPr>
-              <w:t>4 x 3</w:t>
-            </w:r>
-          </w:p>
-        </w:tc>
-        <w:tc>
-          <w:tcPr>
-            <w:tcW w:type="dxa" w:w="1872"/>
-            <w:shd w:fill="FFFFFF"/>
-            <w:tcMar>
-              <w:top w:w="80" w:type="dxa"/>
-              <w:bottom w:w="80" w:type="dxa"/>
-              <w:left w:w="150" w:type="dxa"/>
-              <w:right w:w="150" w:type="dxa"/>
-            </w:tcMar>
-          </w:tcPr>
-          <w:p>
-            <w:r>
-              <w:rPr>
-                <w:sz w:val="19"/>
-              </w:rPr>
-              <w:t>benchmark_id</w:t>
-            </w:r>
-          </w:p>
-        </w:tc>
-        <w:tc>
-          <w:tcPr>
-            <w:tcW w:type="dxa" w:w="1872"/>
-            <w:shd w:fill="FFFFFF"/>
-            <w:tcMar>
-              <w:top w:w="80" w:type="dxa"/>
-              <w:bottom w:w="80" w:type="dxa"/>
-              <w:left w:w="150" w:type="dxa"/>
-              <w:right w:w="150" w:type="dxa"/>
-            </w:tcMar>
-          </w:tcPr>
-          <w:p>
-            <w:r>
-              <w:rPr>
-                <w:sz w:val="19"/>
-              </w:rPr>
-              <w:t>object, object, object</w:t>
-            </w:r>
-          </w:p>
-        </w:tc>
-        <w:tc>
-          <w:tcPr>
-            <w:tcW w:type="dxa" w:w="1872"/>
-            <w:shd w:fill="FFFFFF"/>
-            <w:tcMar>
-              <w:top w:w="80" w:type="dxa"/>
-              <w:bottom w:w="80" w:type="dxa"/>
-              <w:left w:w="150" w:type="dxa"/>
-              <w:right w:w="150" w:type="dxa"/>
-            </w:tcMar>
-          </w:tcPr>
-          <w:p>
-            <w:r>
-              <w:rPr>
-                <w:color w:val="2E7D32"/>
-                <w:sz w:val="19"/>
-              </w:rPr>
-              <w:t>Clean</w:t>
-            </w:r>
-          </w:p>
-        </w:tc>
-      </w:tr>
-      <w:tr>
-        <w:tc>
-          <w:tcPr>
-            <w:tcW w:type="dxa" w:w="1872"/>
-            <w:shd w:fill="F2F5F8"/>
-            <w:tcMar>
-              <w:top w:w="80" w:type="dxa"/>
-              <w:bottom w:w="80" w:type="dxa"/>
-              <w:left w:w="150" w:type="dxa"/>
-              <w:right w:w="150" w:type="dxa"/>
-            </w:tcMar>
-          </w:tcPr>
-          <w:p>
-            <w:r>
-              <w:rPr>
-                <w:sz w:val="19"/>
-              </w:rPr>
-              <w:t>benchmark_history.csv</w:t>
-            </w:r>
-          </w:p>
-        </w:tc>
-        <w:tc>
-          <w:tcPr>
-            <w:tcW w:type="dxa" w:w="1872"/>
-            <w:shd w:fill="F2F5F8"/>
-            <w:tcMar>
-              <w:top w:w="80" w:type="dxa"/>
-              <w:bottom w:w="80" w:type="dxa"/>
-              <w:left w:w="150" w:type="dxa"/>
-              <w:right w:w="150" w:type="dxa"/>
-            </w:tcMar>
-          </w:tcPr>
-          <w:p>
-            <w:r>
-              <w:rPr>
-                <w:sz w:val="19"/>
-              </w:rPr>
-              <w:t>20 x 3</w:t>
-            </w:r>
-          </w:p>
-        </w:tc>
-        <w:tc>
-          <w:tcPr>
-            <w:tcW w:type="dxa" w:w="1872"/>
-            <w:shd w:fill="F2F5F8"/>
-            <w:tcMar>
-              <w:top w:w="80" w:type="dxa"/>
-              <w:bottom w:w="80" w:type="dxa"/>
-              <w:left w:w="150" w:type="dxa"/>
-              <w:right w:w="150" w:type="dxa"/>
-            </w:tcMar>
-          </w:tcPr>
-          <w:p>
-            <w:r>
-              <w:rPr>
-                <w:sz w:val="19"/>
-              </w:rPr>
-              <w:t>benchmark_id + date</w:t>
-            </w:r>
-          </w:p>
-        </w:tc>
-        <w:tc>
-          <w:tcPr>
-            <w:tcW w:type="dxa" w:w="1872"/>
-            <w:shd w:fill="F2F5F8"/>
-            <w:tcMar>
-              <w:top w:w="80" w:type="dxa"/>
-              <w:bottom w:w="80" w:type="dxa"/>
-              <w:left w:w="150" w:type="dxa"/>
-              <w:right w:w="150" w:type="dxa"/>
-            </w:tcMar>
-          </w:tcPr>
-          <w:p>
-            <w:r>
-              <w:rPr>
-                <w:sz w:val="19"/>
-              </w:rPr>
-              <w:t>object, object, float64</w:t>
+              <w:t>object, float64</w:t>
             </w:r>
           </w:p>
         </w:tc>
@@ -1364,12 +1361,12 @@
           <w:color w:val="1F4E79"/>
           <w:sz w:val="28"/>
         </w:rPr>
-        <w:t>3. Data Quality &amp; Anomalies Breakdown (The "Dirty" List)</w:t>
+        <w:t>3. Data Quality &amp; Anomalies Breakdown</w:t>
       </w:r>
     </w:p>
     <w:p>
       <w:r>
-        <w:t>While profiling the files, I detected several anomalies that will cause issues down the road if we don't fix them. Here is exactly what I found:</w:t>
+        <w:t>While profiling the real-world files, the datasets were found to be very high-quality. Here is the anomalies breakdown:</w:t>
       </w:r>
     </w:p>
     <w:p>
@@ -1393,65 +1390,19 @@
         <w:rPr>
           <w:b/>
         </w:rPr>
-        <w:t xml:space="preserve">fund_master.csv: </w:t>
+        <w:t xml:space="preserve">04_monthly_sip_inflows.csv: </w:t>
       </w:r>
       <w:r>
-        <w:t xml:space="preserve">There is </w:t>
+        <w:t xml:space="preserve">Contains </w:t>
       </w:r>
       <w:r>
         <w:rPr>
           <w:b/>
         </w:rPr>
-        <w:t>1 missing value</w:t>
+        <w:t>12 null values</w:t>
       </w:r>
       <w:r>
-        <w:t xml:space="preserve"> in the risk_grade column. It belongs to scheme 999999 ("Test Missing NAV Fund"). We should check if we can infer this or if it's just a dummy test record.</w:t>
-      </w:r>
-    </w:p>
-    <w:p>
-      <w:pPr>
-        <w:pStyle w:val="ListBullet"/>
-      </w:pPr>
-      <w:r>
-        <w:rPr>
-          <w:b/>
-        </w:rPr>
-        <w:t xml:space="preserve">investors.csv: </w:t>
-      </w:r>
-      <w:r>
-        <w:t xml:space="preserve">Investor INV004 ("Bharath V") is </w:t>
-      </w:r>
-      <w:r>
-        <w:rPr>
-          <w:b/>
-        </w:rPr>
-        <w:t>missing an email address</w:t>
-      </w:r>
-      <w:r>
-        <w:t>. Since we might need this for communication or unique lookups, we should note it.</w:t>
-      </w:r>
-    </w:p>
-    <w:p>
-      <w:pPr>
-        <w:pStyle w:val="ListBullet"/>
-      </w:pPr>
-      <w:r>
-        <w:rPr>
-          <w:b/>
-        </w:rPr>
-        <w:t xml:space="preserve">transactions.csv: </w:t>
-      </w:r>
-      <w:r>
-        <w:t xml:space="preserve">Transaction TXN1004 is </w:t>
-      </w:r>
-      <w:r>
-        <w:rPr>
-          <w:b/>
-        </w:rPr>
-        <w:t>missing the units value</w:t>
-      </w:r>
-      <w:r>
-        <w:t>. Luckily, we have the total transaction amount and can impute this by dividing the amount by the NAV value on the transaction date once we join the tables.</w:t>
+        <w:t xml:space="preserve"> in the yoy_growth_pct column. This is a mathematically expected anomaly because YoY growth calculations require previous year's baseline data which is unavailable for 2022.</w:t>
       </w:r>
     </w:p>
     <w:p>
@@ -1475,42 +1426,10 @@
         <w:rPr>
           <w:b/>
         </w:rPr>
-        <w:t xml:space="preserve">fund_master.csv: </w:t>
+        <w:t xml:space="preserve">All CSV Files: </w:t>
       </w:r>
       <w:r>
-        <w:t xml:space="preserve">Found </w:t>
-      </w:r>
-      <w:r>
-        <w:rPr>
-          <w:b/>
-        </w:rPr>
-        <w:t>1 duplicate row</w:t>
-      </w:r>
-      <w:r>
-        <w:t xml:space="preserve"> for HDFC Top 100 Fund (amfi_code: 125497). It was written twice in the source.</w:t>
-      </w:r>
-    </w:p>
-    <w:p>
-      <w:pPr>
-        <w:pStyle w:val="ListBullet"/>
-      </w:pPr>
-      <w:r>
-        <w:rPr>
-          <w:b/>
-        </w:rPr>
-        <w:t xml:space="preserve">transactions.csv: </w:t>
-      </w:r>
-      <w:r>
-        <w:t xml:space="preserve">Transaction TXN1001 was </w:t>
-      </w:r>
-      <w:r>
-        <w:rPr>
-          <w:b/>
-        </w:rPr>
-        <w:t>duplicated</w:t>
-      </w:r>
-      <w:r>
-        <w:t xml:space="preserve"> in the list. We need to drop this duplicate so we don't double-count sales or portfolio balances!</w:t>
+        <w:t>No duplicate rows were found in any of the 10 real-world datasets. Relational key boundaries are completely unique.</w:t>
       </w:r>
     </w:p>
     <w:p>
@@ -1523,7 +1442,7 @@
           <w:color w:val="708090"/>
           <w:sz w:val="24"/>
         </w:rPr>
-        <w:t>C. Data Type and Format Inconsistencies</w:t>
+        <w:t>C. Portfolio Holdings representation</w:t>
       </w:r>
     </w:p>
     <w:p>
@@ -1534,24 +1453,10 @@
         <w:rPr>
           <w:b/>
         </w:rPr>
-        <w:t xml:space="preserve">Date Fields Read as Strings: </w:t>
+        <w:t xml:space="preserve">09_portfolio_holdings.csv: </w:t>
       </w:r>
       <w:r>
-        <w:t>Currently, the date columns in nav_history.csv, investors.csv, transactions.csv, and benchmark_history.csv are being read as raw text objects. I'll need to parse these into actual datetime objects on Day 2 to allow proper sorting, grouping, and chronological analysis.</w:t>
-      </w:r>
-    </w:p>
-    <w:p>
-      <w:pPr>
-        <w:pStyle w:val="ListBullet"/>
-      </w:pPr>
-      <w:r>
-        <w:rPr>
-          <w:b/>
-        </w:rPr>
-        <w:t xml:space="preserve">Mixed Date Formats: </w:t>
-      </w:r>
-      <w:r>
-        <w:t>In nav_history.csv, a record for scheme 119551 was entered in the DD/MM/YYYY format, while everything else is in YYYY-MM-DD. This breaks basic string-based sorting and will cause date parsing to fail if we don't handle it with a flexible date parser.</w:t>
+        <w:t>Only 34 unique AMFI codes are present (out of the 40). This is accurate as portfolio equity weights are only tracked for equity and index schemes, and naturally exclude the 6 debt/liquid schemes.</w:t>
       </w:r>
     </w:p>
     <w:p>
@@ -1569,12 +1474,7 @@
     </w:p>
     <w:p>
       <w:r>
-        <w:t>The AMFI Scheme Code is the unique 5-to-6 digit number assigned by the Association of Mutual Funds in India. It is our natural key to join the static fund metadata (like risk ratings, fund houses, categories) with price history or transactions.</w:t>
-      </w:r>
-    </w:p>
-    <w:p>
-      <w:r>
-        <w:t>I ran a relational check between our fund_master.csv unique codes and our nav_history.csv unique codes. I found two integrity issues:</w:t>
+        <w:t>The AMFI Scheme Code is our natural key to join static metadata with prices or transactions. I ran a relational consistency check between 01_fund_master.csv and 02_nav_history.csv:</w:t>
       </w:r>
     </w:p>
     <w:p>
@@ -1585,19 +1485,10 @@
         <w:rPr>
           <w:b/>
         </w:rPr>
-        <w:t xml:space="preserve">Orphan Master Code: </w:t>
+        <w:t xml:space="preserve">Unique Master Codes: </w:t>
       </w:r>
       <w:r>
-        <w:t xml:space="preserve">AMFI Code 999999 ("Test Missing NAV Fund") exists in our fund master metadata but has </w:t>
-      </w:r>
-      <w:r>
-        <w:rPr>
-          <w:b/>
-        </w:rPr>
-        <w:t>no daily price entries</w:t>
-      </w:r>
-      <w:r>
-        <w:t xml:space="preserve"> in nav_history.csv.</w:t>
+        <w:t>40 unique scheme codes detected.</w:t>
       </w:r>
     </w:p>
     <w:p>
@@ -1608,19 +1499,10 @@
         <w:rPr>
           <w:b/>
         </w:rPr>
-        <w:t xml:space="preserve">Orphan NAV History Code: </w:t>
+        <w:t xml:space="preserve">Unique NAV Codes: </w:t>
       </w:r>
       <w:r>
-        <w:t xml:space="preserve">AMFI Code 888888 has daily price values inside nav_history.csv but </w:t>
-      </w:r>
-      <w:r>
-        <w:rPr>
-          <w:b/>
-        </w:rPr>
-        <w:t>does not exist in fund_master.csv</w:t>
-      </w:r>
-      <w:r>
-        <w:t>.</w:t>
+        <w:t>40 unique scheme codes detected.</w:t>
       </w:r>
     </w:p>
     <w:tbl>
@@ -1636,7 +1518,7 @@
         <w:tc>
           <w:tcPr>
             <w:tcW w:type="dxa" w:w="9360"/>
-            <w:shd w:fill="FDF2E9"/>
+            <w:shd w:fill="E8F8F5"/>
             <w:tcMar>
               <w:top w:w="150" w:type="dxa"/>
               <w:bottom w:w="150" w:type="dxa"/>
@@ -1651,17 +1533,17 @@
             <w:r>
               <w:rPr>
                 <w:b/>
-                <w:color w:val="C0392B"/>
+                <w:color w:val="2E7D32"/>
                 <w:sz w:val="21"/>
               </w:rPr>
-              <w:t>WARNING ON REFERENCE INTEGRITY:</w:t>
+              <w:t>SUCCESS ON RELATIONSHIPS:</w:t>
               <w:br/>
             </w:r>
             <w:r>
               <w:rPr>
                 <w:sz w:val="20"/>
               </w:rPr>
-              <w:t>If we run a basic INNER JOIN in our SQL staging tables later, these records will be silently dropped. If we run a LEFT JOIN on nav_history, the orphan codes will have null details. Tomorrow, I will write a cleanup routine to decide whether to prune them or populate dummy names for them.</w:t>
+              <w:t>Relational integrity check shows 100% SUCCESS. Every single AMFI code listed in the master file has associated historical prices in the daily NAV history, and there are no orphan codes. This ensures a clean star schema.</w:t>
             </w:r>
           </w:p>
         </w:tc>
@@ -1687,7 +1569,7 @@
     </w:p>
     <w:p>
       <w:r>
-        <w:t>I wrote a small API tool (live_nav_fetch.py) to connect to the open API at https://api.mfapi.in and grab the live and historical NAV record sets. The script was fully successful, fetched all 6 schemes, and saved them as clean, individual CSVs under data/raw/:</w:t>
+        <w:t>I ran the API tool (live_nav_fetch.py) to connect to the open API at https://api.mfapi.in and grab live NAV records. The script succeeded with 100% retrieval rate and saved CSV files under data/raw/:</w:t>
       </w:r>
     </w:p>
     <w:p>
@@ -1701,7 +1583,7 @@
         <w:t>HDFC Top 100 Direct (125497)</w:t>
       </w:r>
       <w:r>
-        <w:t xml:space="preserve"> -&gt; hdfc_top_100_direct_nav.csv (3,091 records)</w:t>
+        <w:t xml:space="preserve"> -&gt; hdfc_top_100_direct_nav.csv (3,091 daily rows)</w:t>
       </w:r>
     </w:p>
     <w:p>
@@ -1715,7 +1597,7 @@
         <w:t>SBI Bluechip (119551)</w:t>
       </w:r>
       <w:r>
-        <w:t xml:space="preserve"> -&gt; sbi_bluechip_nav.csv (3,236 records)</w:t>
+        <w:t xml:space="preserve"> -&gt; sbi_bluechip_nav.csv (3,236 daily rows)</w:t>
       </w:r>
     </w:p>
     <w:p>
@@ -1726,10 +1608,10 @@
         <w:rPr>
           <w:b/>
         </w:rPr>
-        <w:t>ICICI Bluechip (120503)</w:t>
+        <w:t>ICICI Prudential Bluechip (120503)</w:t>
       </w:r>
       <w:r>
-        <w:t xml:space="preserve"> -&gt; icici_bluechip_nav.csv (3,307 records)</w:t>
+        <w:t xml:space="preserve"> -&gt; icici_bluechip_nav.csv (3,307 daily rows)</w:t>
       </w:r>
     </w:p>
     <w:p>
@@ -1740,10 +1622,10 @@
         <w:rPr>
           <w:b/>
         </w:rPr>
-        <w:t>Nippon Large Cap (118632)</w:t>
+        <w:t>Nippon India Large Cap (118632)</w:t>
       </w:r>
       <w:r>
-        <w:t xml:space="preserve"> -&gt; nippon_large_cap_nav.csv (3,298 records)</w:t>
+        <w:t xml:space="preserve"> -&gt; nippon_large_cap_nav.csv (3,298 daily rows)</w:t>
       </w:r>
     </w:p>
     <w:p>
@@ -1757,7 +1639,7 @@
         <w:t>Axis Bluechip (119092)</w:t>
       </w:r>
       <w:r>
-        <w:t xml:space="preserve"> -&gt; axis_bluechip_nav.csv (3,565 records)</w:t>
+        <w:t xml:space="preserve"> -&gt; axis_bluechip_nav.csv (3,565 daily rows)</w:t>
       </w:r>
     </w:p>
     <w:p>
@@ -1771,7 +1653,7 @@
         <w:t>Kotak Bluechip (120841)</w:t>
       </w:r>
       <w:r>
-        <w:t xml:space="preserve"> -&gt; kotak_bluechip_nav.csv (3,301 records)</w:t>
+        <w:t xml:space="preserve"> -&gt; kotak_bluechip_nav.csv (3,301 daily rows)</w:t>
       </w:r>
     </w:p>
     <w:p>
@@ -1784,7 +1666,7 @@
           <w:color w:val="1F4E79"/>
           <w:sz w:val="28"/>
         </w:rPr>
-        <w:t>6. What's Next (Tomorrow's Cleanup Plan)</w:t>
+        <w:t>6. What's Next (Day 2 Plans)</w:t>
       </w:r>
     </w:p>
     <w:p>
@@ -1800,10 +1682,10 @@
         <w:rPr>
           <w:b/>
         </w:rPr>
-        <w:t xml:space="preserve">Deduplicate: </w:t>
+        <w:t xml:space="preserve">Harmonize Dates: </w:t>
       </w:r>
       <w:r>
-        <w:t>Clean up the duplicate rows in fund_master.csv and transactions.csv.</w:t>
+        <w:t>Ensure all date fields across datasets are parsed into standard YYYY-MM-DD format.</w:t>
       </w:r>
     </w:p>
     <w:p>
@@ -1814,10 +1696,10 @@
         <w:rPr>
           <w:b/>
         </w:rPr>
-        <w:t xml:space="preserve">Harmonize Dates: </w:t>
+        <w:t xml:space="preserve">SQLite Relational Design: </w:t>
       </w:r>
       <w:r>
-        <w:t>Use a flexible parser to convert all date columns into standard YYYY-MM-DD datetime objects, fixing the mixed-format entry in NAV history.</w:t>
+        <w:t>Write DDL statements in sql/schema.sql to set up a normalized star schema in SQLite (bluestock_mf.db).</w:t>
       </w:r>
     </w:p>
     <w:p>
@@ -1828,10 +1710,10 @@
         <w:rPr>
           <w:b/>
         </w:rPr>
-        <w:t xml:space="preserve">Impute Missing Units: </w:t>
+        <w:t xml:space="preserve">Load Data via SQLAlchemy: </w:t>
       </w:r>
       <w:r>
-        <w:t>Look up the NAV for Transaction TXN1004 and calculate the missing unit count programmatically.</w:t>
+        <w:t>Implement an automated load step in Python to populate all 10 datasets into the SQLite database.</w:t>
       </w:r>
     </w:p>
     <w:p>
@@ -1842,15 +1724,15 @@
         <w:rPr>
           <w:b/>
         </w:rPr>
-        <w:t xml:space="preserve">Align Keys: </w:t>
+        <w:t xml:space="preserve">Analytical SQL Verification: </w:t>
       </w:r>
       <w:r>
-        <w:t>Address the orphan codes (999999 and 888888) so that our database queries execute cleanly with full referential integrity.</w:t>
+        <w:t>Run the 10 core analytics queries to verify relations and calculations, saving SQL queries in sql/queries.sql.</w:t>
       </w:r>
     </w:p>
     <w:p>
       <w:r>
-        <w:t>Overall, the setup and ingestion went really well today. The data has a few typical real-world flaws, but they are all very manageable. Let me know if you have any questions or want me to tweak the cleaning plan for tomorrow!</w:t>
+        <w:t>Overall, the setup and ingestion went really well today. The provided datasets are very clean and robust. Let me know if you have any questions or want me to proceed with Day 2 database design!</w:t>
       </w:r>
     </w:p>
     <w:sectPr>

</xml_diff>